<commit_message>
Updated the Diagrams to depict the updated BR flow
</commit_message>
<xml_diff>
--- a/Design_Docs/ESC_Landing_Zone_Branching_Strategy_Revised_Hotfix_Flow.docx
+++ b/Design_Docs/ESC_Landing_Zone_Branching_Strategy_Revised_Hotfix_Flow.docx
@@ -1994,11 +1994,17 @@
         <w:rPr>
           <w:noProof/>
         </w:rPr>
+        <w:t xml:space="preserve">    </w:t>
+      </w:r>
+      <w:r>
+        <w:rPr>
+          <w:noProof/>
+        </w:rPr>
         <w:drawing>
-          <wp:inline distT="0" distB="0" distL="0" distR="0" wp14:anchorId="33BBB1F6" wp14:editId="1C78A3C5">
-            <wp:extent cx="7357840" cy="5517884"/>
-            <wp:effectExtent l="0" t="0" r="0" b="6985"/>
-            <wp:docPr id="1293420837" name="Picture 5"/>
+          <wp:inline distT="0" distB="0" distL="0" distR="0" wp14:anchorId="79CBD2DE" wp14:editId="57239CE0">
+            <wp:extent cx="9418320" cy="5300345"/>
+            <wp:effectExtent l="0" t="0" r="0" b="0"/>
+            <wp:docPr id="1892761384" name="Picture 1"/>
             <wp:cNvGraphicFramePr>
               <a:graphicFrameLocks xmlns:a="http://schemas.openxmlformats.org/drawingml/2006/main" noChangeAspect="1"/>
             </wp:cNvGraphicFramePr>
@@ -2006,36 +2012,23 @@
               <a:graphicData uri="http://schemas.openxmlformats.org/drawingml/2006/picture">
                 <pic:pic xmlns:pic="http://schemas.openxmlformats.org/drawingml/2006/picture">
                   <pic:nvPicPr>
-                    <pic:cNvPr id="0" name="Picture 3"/>
-                    <pic:cNvPicPr>
-                      <a:picLocks noChangeAspect="1" noChangeArrowheads="1"/>
-                    </pic:cNvPicPr>
+                    <pic:cNvPr id="1892761384" name="Picture 1892761384"/>
+                    <pic:cNvPicPr/>
                   </pic:nvPicPr>
                   <pic:blipFill>
-                    <a:blip r:embed="rId12">
-                      <a:extLst>
-                        <a:ext uri="{28A0092B-C50C-407E-A947-70E740481C1C}">
-                          <a14:useLocalDpi xmlns:a14="http://schemas.microsoft.com/office/drawing/2010/main" val="0"/>
-                        </a:ext>
-                      </a:extLst>
-                    </a:blip>
-                    <a:srcRect/>
+                    <a:blip r:embed="rId12"/>
                     <a:stretch>
                       <a:fillRect/>
                     </a:stretch>
                   </pic:blipFill>
-                  <pic:spPr bwMode="auto">
+                  <pic:spPr>
                     <a:xfrm>
                       <a:off x="0" y="0"/>
-                      <a:ext cx="7371285" cy="5527967"/>
+                      <a:ext cx="9418320" cy="5300345"/>
                     </a:xfrm>
                     <a:prstGeom prst="rect">
                       <a:avLst/>
                     </a:prstGeom>
-                    <a:noFill/>
-                    <a:ln>
-                      <a:noFill/>
-                    </a:ln>
                   </pic:spPr>
                 </pic:pic>
               </a:graphicData>
@@ -2049,21 +2042,25 @@
         <w:rPr>
           <w:b/>
           <w:bCs/>
+          <w:color w:val="00B050"/>
+          <w:sz w:val="19"/>
+          <w:szCs w:val="19"/>
+          <w:lang w:val="en-IN"/>
+        </w:rPr>
+      </w:pPr>
+      <w:r>
+        <w:rPr>
           <w:sz w:val="16"/>
-          <w:lang w:val="en-IN"/>
-        </w:rPr>
-      </w:pPr>
-      <w:r>
-        <w:rPr>
-          <w:sz w:val="16"/>
-        </w:rPr>
-        <w:t xml:space="preserve">                                                        </w:t>
-      </w:r>
-      <w:r>
-        <w:rPr>
-          <w:b/>
-          <w:bCs/>
-          <w:sz w:val="16"/>
+        </w:rPr>
+        <w:t xml:space="preserve">                               </w:t>
+      </w:r>
+      <w:r>
+        <w:rPr>
+          <w:b/>
+          <w:bCs/>
+          <w:color w:val="00B050"/>
+          <w:sz w:val="19"/>
+          <w:szCs w:val="19"/>
         </w:rPr>
         <w:t xml:space="preserve">Complete branch lifecycle: feature development, release promotion, hotfix handling and </w:t>
       </w:r>
@@ -2071,7 +2068,9 @@
         <w:rPr>
           <w:b/>
           <w:bCs/>
-          <w:sz w:val="16"/>
+          <w:color w:val="00B050"/>
+          <w:sz w:val="19"/>
+          <w:szCs w:val="19"/>
           <w:lang w:val="en-IN"/>
         </w:rPr>
         <w:t xml:space="preserve">promotion of approved hotfixes to the </w:t>
@@ -2080,7 +2079,9 @@
         <w:rPr>
           <w:b/>
           <w:bCs/>
-          <w:sz w:val="16"/>
+          <w:color w:val="00B050"/>
+          <w:sz w:val="19"/>
+          <w:szCs w:val="19"/>
           <w:lang w:val="en-IN"/>
         </w:rPr>
         <w:t>active</w:t>
@@ -2088,8 +2089,11 @@
       <w:r>
         <w:rPr>
           <w:rFonts w:ascii="Segoe UI" w:eastAsia="Times New Roman" w:hAnsi="Segoe UI" w:cs="Segoe UI"/>
-          <w:sz w:val="21"/>
-          <w:szCs w:val="21"/>
+          <w:b/>
+          <w:bCs/>
+          <w:color w:val="00B050"/>
+          <w:sz w:val="19"/>
+          <w:szCs w:val="19"/>
           <w:lang w:val="en-IN" w:eastAsia="en-IN"/>
         </w:rPr>
         <w:t xml:space="preserve"> </w:t>
@@ -2098,7 +2102,9 @@
         <w:rPr>
           <w:b/>
           <w:bCs/>
-          <w:sz w:val="16"/>
+          <w:color w:val="00B050"/>
+          <w:sz w:val="19"/>
+          <w:szCs w:val="19"/>
           <w:lang w:val="en-IN"/>
         </w:rPr>
         <w:t>release branch</w:t>
@@ -4591,10 +4597,10 @@
           <w:noProof/>
         </w:rPr>
         <w:drawing>
-          <wp:inline distT="0" distB="0" distL="0" distR="0" wp14:anchorId="4912FC6B" wp14:editId="3D31015B">
-            <wp:extent cx="6115050" cy="3442349"/>
-            <wp:effectExtent l="0" t="0" r="0" b="5715"/>
-            <wp:docPr id="1270731389" name="Picture 4"/>
+          <wp:inline distT="0" distB="0" distL="0" distR="0" wp14:anchorId="18A9E9D9" wp14:editId="596ABC72">
+            <wp:extent cx="10140950" cy="5707380"/>
+            <wp:effectExtent l="0" t="0" r="0" b="7620"/>
+            <wp:docPr id="1445305556" name="Picture 2"/>
             <wp:cNvGraphicFramePr>
               <a:graphicFrameLocks xmlns:a="http://schemas.openxmlformats.org/drawingml/2006/main" noChangeAspect="1"/>
             </wp:cNvGraphicFramePr>
@@ -4602,36 +4608,23 @@
               <a:graphicData uri="http://schemas.openxmlformats.org/drawingml/2006/picture">
                 <pic:pic xmlns:pic="http://schemas.openxmlformats.org/drawingml/2006/picture">
                   <pic:nvPicPr>
-                    <pic:cNvPr id="0" name="Picture 1"/>
-                    <pic:cNvPicPr>
-                      <a:picLocks noChangeAspect="1" noChangeArrowheads="1"/>
-                    </pic:cNvPicPr>
+                    <pic:cNvPr id="1445305556" name="Picture 1445305556"/>
+                    <pic:cNvPicPr/>
                   </pic:nvPicPr>
                   <pic:blipFill>
-                    <a:blip r:embed="rId13">
-                      <a:extLst>
-                        <a:ext uri="{28A0092B-C50C-407E-A947-70E740481C1C}">
-                          <a14:useLocalDpi xmlns:a14="http://schemas.microsoft.com/office/drawing/2010/main" val="0"/>
-                        </a:ext>
-                      </a:extLst>
-                    </a:blip>
-                    <a:srcRect/>
+                    <a:blip r:embed="rId13"/>
                     <a:stretch>
                       <a:fillRect/>
                     </a:stretch>
                   </pic:blipFill>
-                  <pic:spPr bwMode="auto">
+                  <pic:spPr>
                     <a:xfrm>
                       <a:off x="0" y="0"/>
-                      <a:ext cx="6124401" cy="3447613"/>
+                      <a:ext cx="10140950" cy="5707380"/>
                     </a:xfrm>
                     <a:prstGeom prst="rect">
                       <a:avLst/>
                     </a:prstGeom>
-                    <a:noFill/>
-                    <a:ln>
-                      <a:noFill/>
-                    </a:ln>
                   </pic:spPr>
                 </pic:pic>
               </a:graphicData>
@@ -4645,27 +4638,46 @@
         <w:rPr>
           <w:b/>
           <w:bCs/>
+          <w:color w:val="00B050"/>
+          <w:sz w:val="19"/>
+          <w:szCs w:val="19"/>
         </w:rPr>
       </w:pPr>
       <w:r>
         <w:rPr>
           <w:sz w:val="16"/>
         </w:rPr>
-        <w:t xml:space="preserve">                                                                     </w:t>
-      </w:r>
-      <w:r>
-        <w:rPr>
-          <w:b/>
-          <w:bCs/>
+        <w:t xml:space="preserve">                                                                  </w:t>
+      </w:r>
+      <w:r>
+        <w:rPr>
           <w:sz w:val="16"/>
         </w:rPr>
+        <w:t xml:space="preserve">             </w:t>
+      </w:r>
+      <w:r>
+        <w:rPr>
+          <w:sz w:val="16"/>
+        </w:rPr>
+        <w:t xml:space="preserve">   </w:t>
+      </w:r>
+      <w:r>
+        <w:rPr>
+          <w:b/>
+          <w:bCs/>
+          <w:color w:val="00B050"/>
+          <w:sz w:val="19"/>
+          <w:szCs w:val="19"/>
+        </w:rPr>
         <w:t xml:space="preserve">Initial OU deployment mapped to release, Staging validation, Production promotion, </w:t>
       </w:r>
       <w:r>
         <w:rPr>
           <w:b/>
           <w:bCs/>
-          <w:sz w:val="16"/>
+          <w:color w:val="00B050"/>
+          <w:sz w:val="19"/>
+          <w:szCs w:val="19"/>
         </w:rPr>
         <w:t>Hotfix</w:t>
       </w:r>
@@ -4673,7 +4685,9 @@
         <w:rPr>
           <w:b/>
           <w:bCs/>
-          <w:sz w:val="16"/>
+          <w:color w:val="00B050"/>
+          <w:sz w:val="19"/>
+          <w:szCs w:val="19"/>
         </w:rPr>
         <w:t xml:space="preserve"> handling and governance.</w:t>
       </w:r>

</xml_diff>